<commit_message>
docs: update senior citizen reason exclusion to NOT IN ('SIGNATURE_DECLINED', 'ORDER_ADDRESS_UPDATED')
Co-authored-by: slice-siddharthb <slice-siddharthb@users.noreply.github.com>
</commit_message>
<xml_diff>
--- a/docs/HOR-DSA_Services___druid_gold.services_orders___services_trackings.docx
+++ b/docs/HOR-DSA_Services___druid_gold.services_orders___services_trackings.docx
@@ -999,7 +999,7 @@
           <w:color w:val="C7254E"/>
           <w:sz w:val="18"/>
         </w:rPr>
-        <w:t>services_trackings.reason != 'SIGNATURE_DECLINED'</w:t>
+        <w:t>services_trackings.reason NOT IN ('SIGNATURE_DECLINED', 'ORDER_ADDRESS_UPDATED')</w:t>
       </w:r>
     </w:p>
     <w:p>
@@ -4191,7 +4191,7 @@
               <w:rPr>
                 <w:sz w:val="18"/>
               </w:rPr>
-              <w:t xml:space="preserve">Populated on every status. Key exclusion: </w:t>
+              <w:t xml:space="preserve">Populated on every status. Key exclusions for senior citizen identification: </w:t>
             </w:r>
             <w:r>
               <w:rPr>
@@ -4199,13 +4199,41 @@
                 <w:color w:val="C7254E"/>
                 <w:sz w:val="18"/>
               </w:rPr>
-              <w:t>reason != 'SIGNATURE_DECLINED'</w:t>
-            </w:r>
-            <w:r>
-              <w:rPr>
-                <w:sz w:val="18"/>
-              </w:rPr>
-              <w:t xml:space="preserve"> for senior citizen identification.</w:t>
+              <w:t>reason NOT IN ('SIGNATURE_DECLINED', 'ORDER_ADDRESS_UPDATED')</w:t>
+            </w:r>
+            <w:r>
+              <w:rPr>
+                <w:sz w:val="18"/>
+              </w:rPr>
+              <w:t xml:space="preserve">. </w:t>
+            </w:r>
+            <w:r>
+              <w:rPr>
+                <w:rFonts w:ascii="Courier New" w:hAnsi="Courier New"/>
+                <w:color w:val="C7254E"/>
+                <w:sz w:val="18"/>
+              </w:rPr>
+              <w:t>ORDER_ADDRESS_UPDATED</w:t>
+            </w:r>
+            <w:r>
+              <w:rPr>
+                <w:sz w:val="18"/>
+              </w:rPr>
+              <w:t xml:space="preserve"> = address update before clicking "Order Now" (order not yet placed). </w:t>
+            </w:r>
+            <w:r>
+              <w:rPr>
+                <w:rFonts w:ascii="Courier New" w:hAnsi="Courier New"/>
+                <w:color w:val="C7254E"/>
+                <w:sz w:val="18"/>
+              </w:rPr>
+              <w:t>SIGNATURE_DECLINED</w:t>
+            </w:r>
+            <w:r>
+              <w:rPr>
+                <w:sz w:val="18"/>
+              </w:rPr>
+              <w:t xml:space="preserve"> = order rejected at signature stage.</w:t>
             </w:r>
           </w:p>
         </w:tc>
@@ -7947,7 +7975,7 @@
           <w:color w:val="555555"/>
           <w:sz w:val="20"/>
         </w:rPr>
-        <w:t xml:space="preserve">. For senior citizen identification, the only exclusion needed is </w:t>
+        <w:t xml:space="preserve">. For senior citizen identification, exclude both </w:t>
       </w:r>
       <w:r>
         <w:rPr>
@@ -7956,7 +7984,7 @@
           <w:color w:val="555555"/>
           <w:sz w:val="18"/>
         </w:rPr>
-        <w:t>reason != 'SIGNATURE_DECLINED'</w:t>
+        <w:t>'SIGNATURE_DECLINED'</w:t>
       </w:r>
       <w:r>
         <w:rPr>
@@ -7964,7 +7992,24 @@
           <w:color w:val="555555"/>
           <w:sz w:val="20"/>
         </w:rPr>
-        <w:t>.</w:t>
+        <w:t xml:space="preserve"> (order rejected at signature stage) and </w:t>
+      </w:r>
+      <w:r>
+        <w:rPr>
+          <w:rFonts w:ascii="Courier New" w:hAnsi="Courier New"/>
+          <w:i/>
+          <w:color w:val="555555"/>
+          <w:sz w:val="18"/>
+        </w:rPr>
+        <w:t>'ORDER_ADDRESS_UPDATED'</w:t>
+      </w:r>
+      <w:r>
+        <w:rPr>
+          <w:i/>
+          <w:color w:val="555555"/>
+          <w:sz w:val="20"/>
+        </w:rPr>
+        <w:t xml:space="preserve"> (tracking row upserted when user updates address before clicking "Order Now" — not a placed order).</w:t>
       </w:r>
     </w:p>
     <w:p>
@@ -9606,7 +9651,7 @@
           <w:color w:val="1F1F1F"/>
           <w:sz w:val="17"/>
         </w:rPr>
-        <w:t xml:space="preserve">  AND st.reason != 'SIGNATURE_DECLINED'</w:t>
+        <w:t xml:space="preserve">  AND st.reason NOT IN ('SIGNATURE_DECLINED', 'ORDER_ADDRESS_UPDATED')</w:t>
       </w:r>
     </w:p>
     <w:p>
@@ -10317,7 +10362,7 @@
           <w:color w:val="1F1F1F"/>
           <w:sz w:val="17"/>
         </w:rPr>
-        <w:t xml:space="preserve">      AND st.reason != 'SIGNATURE_DECLINED'</w:t>
+        <w:t xml:space="preserve">      AND st.reason NOT IN ('SIGNATURE_DECLINED', 'ORDER_ADDRESS_UPDATED')</w:t>
       </w:r>
     </w:p>
     <w:p>

</xml_diff>